<commit_message>
#4 Allow public websites in URL, Web Search and API Request
Docker Desktop's DNS answered every IPv4 address with an extra
IPv6-mapped record (::ffff:a.b.c.d). Langflow's SSRF protection blocks
that whole range, so almost every website counted as internal. The
container now resolves with the no-aaaa option, which leaves only the
real IPv4 addresses. The protection stays on: localhost is still
blocked.

The component guide (Markdown, Word, PDF) drops the note about wrongly
blocked websites and adds how to set a User-Agent in the URL block,
which some sites like Wikipedia require.

Closes #4
</commit_message>
<xml_diff>
--- a/dokumente/Langflow-Bausteine_DE.docx
+++ b/dokumente/Langflow-Bausteine_DE.docx
@@ -3374,7 +3374,20 @@
         <w:t xml:space="preserve">Hinweis:</w:t>
       </w:r>
       <w:r>
-        <w:t xml:space="preserve"> Langflow sperrt Adressen, die es für intern hält. Auf manchen Rechnern trifft das fälschlich auch normale Webseiten, mit der Fehlermeldung </w:t>
+        <w:t xml:space="preserve"> Langflow sperrt Adressen auf dem Laptop oder im lokalen Netz, z. B. </w:t>
+      </w:r>
+      <w:r>
+        <w:rPr>
+          <w:rFonts w:ascii="Consolas" w:cs="Consolas" w:eastAsia="Consolas" w:hAnsi="Consolas"/>
+          <w:color w:val="2B2B2B"/>
+          <w:sz w:val="19"/>
+          <w:szCs w:val="19"/>
+          <w:shd w:fill="F2F2F0" w:color="auto" w:val="clear"/>
+        </w:rPr>
+        <w:t xml:space="preserve">localhost</w:t>
+      </w:r>
+      <w:r>
+        <w:t xml:space="preserve">, mit der Fehlermeldung </w:t>
       </w:r>
       <w:r>
         <w:rPr>
@@ -3384,7 +3397,7 @@
         <w:t xml:space="preserve">SSRF Protection: … resolves to blocked IP address</w:t>
       </w:r>
       <w:r>
-        <w:t xml:space="preserve">. Die Bibliotheks-Datenbanken (Crossref, OpenAlex, Unpaywall, DataCite, lobid) sind in diesem Projekt freigegeben. Für andere Adressen fragt die Orga.</w:t>
+        <w:t xml:space="preserve">. Öffentliche Webseiten und die Bibliotheks-Datenbanken funktionieren.</w:t>
       </w:r>
     </w:p>
     <w:p>
@@ -4888,6 +4901,16 @@
           <w:i/>
           <w:iCs/>
         </w:rPr>
+        <w:t xml:space="preserve">Headers</w:t>
+      </w:r>
+      <w:r>
+        <w:t xml:space="preserve">, </w:t>
+      </w:r>
+      <w:r>
+        <w:rPr>
+          <w:i/>
+          <w:iCs/>
+        </w:rPr>
         <w:t xml:space="preserve">Timeout</w:t>
       </w:r>
       <w:r>
@@ -4916,17 +4939,40 @@
         <w:t xml:space="preserve">API Request</w:t>
       </w:r>
       <w:r>
-        <w:t xml:space="preserve">. Scheitert eine Seite mit </w:t>
+        <w:t xml:space="preserve">. Manche Webseiten, z. B. Wikipedia, lehnen Anfragen ohne Absenderkennung ab. Dann unter </w:t>
       </w:r>
       <w:r>
         <w:rPr>
           <w:i/>
           <w:iCs/>
         </w:rPr>
-        <w:t xml:space="preserve">SSRF Protection</w:t>
-      </w:r>
-      <w:r>
-        <w:t xml:space="preserve">, fragt die Orga.</w:t>
+        <w:t xml:space="preserve">Headers</w:t>
+      </w:r>
+      <w:r>
+        <w:t xml:space="preserve"> in der Zeile </w:t>
+      </w:r>
+      <w:r>
+        <w:rPr>
+          <w:i/>
+          <w:iCs/>
+        </w:rPr>
+        <w:t xml:space="preserve">User-Agent</w:t>
+      </w:r>
+      <w:r>
+        <w:t xml:space="preserve"> eine eintragen, z. B. </w:t>
+      </w:r>
+      <w:r>
+        <w:rPr>
+          <w:rFonts w:ascii="Consolas" w:cs="Consolas" w:eastAsia="Consolas" w:hAnsi="Consolas"/>
+          <w:color w:val="2B2B2B"/>
+          <w:sz w:val="19"/>
+          <w:szCs w:val="19"/>
+          <w:shd w:fill="F2F2F0" w:color="auto" w:val="clear"/>
+        </w:rPr>
+        <w:t xml:space="preserve">Bibliothekshackathon (Langflow)</w:t>
+      </w:r>
+      <w:r>
+        <w:t xml:space="preserve">.</w:t>
       </w:r>
     </w:p>
     <w:p>

</xml_diff>